<commit_message>
feat(showcase): add craft-evidence showcase across README, CVs and data
Adds 45-showcase.yaml (reports, films, decks, slides, newsletters,
transformation, SEO/GEO) with schema, collages and a README block; a native
Chapter 4 in the extended CV with film watch links and Luka Madzarac's
endorsement; short-CV Built lines without markers, re-chosen projects and
refreshed reach numbers under the historical-maximum display rule.

Co-authored-by: Cursor <cursoragent@cursor.com>
</commit_message>
<xml_diff>
--- a/cv/exports/chan-meng-cv-ats.docx
+++ b/cv/exports/chan-meng-cv-ats.docx
@@ -253,7 +253,7 @@
         <w:spacing w:after="60"/>
       </w:pPr>
       <w:r>
-        <w:t xml:space="preserve">Build an AI design agent for architects and self-builders; invented ArchLang, the open-source language that compiles a floor plan into a dimensioned drawing (53 npm releases, 139 diagnostic codes), so every plan is checked and an edit is exact.</w:t>
+        <w:t xml:space="preserve">Build an AI design agent for architects and self-builders; invented ArchLang, the open-source language that compiles a floor plan into a dimensioned drawing (53 npm releases, 139 diagnostic codes), so every plan is checked and an edit is exact; live at archcanvas.uk and archlang.uk.</w:t>
       </w:r>
     </w:p>
     <w:p>
@@ -297,7 +297,7 @@
         <w:spacing w:after="60"/>
       </w:pPr>
       <w:r>
-        <w:t xml:space="preserve">Sole engineer, remotely, across two platform generations for an organisation self-described as China's first in women's health technology; built the pages and application system for its 2026 Shanghai Summit (four days, 20 speakers, headlined by Ida Tin).</w:t>
+        <w:t xml:space="preserve">Sole engineer, remotely, across two platform generations for an organisation self-described as China's first in women's health technology; built the pages and application system for its 2026 Shanghai Summit (four days, 20 speakers, headlined by Ida Tin); site: femtechweekend.com.</w:t>
       </w:r>
     </w:p>
     <w:p>
@@ -354,7 +354,7 @@
         <w:spacing w:after="60"/>
       </w:pPr>
       <w:r>
-        <w:t xml:space="preserve">Cut a 1,549-person mailing list over from Mailchimp to self-hosted double opt-in with 0 failures, and rewrote the charity's recurring work as 11 agent skills, reviewed by pull request and type-checked in CI, that non-engineers can follow.</w:t>
+        <w:t xml:space="preserve">Cut a 1,549-person mailing list over from Mailchimp to self-hosted double opt-in with 0 failures, and rewrote the charity's recurring work as 11 agent skills, reviewed by pull request and type-checked in CI, that non-engineers can follow; built shesharp.org.nz, its newsletter and its event decks.</w:t>
       </w:r>
     </w:p>
     <w:p>
@@ -398,7 +398,7 @@
         <w:spacing w:after="60"/>
       </w:pPr>
       <w:r>
-        <w:t xml:space="preserve">Owned the Intelligence Layer of an app-activation platform: a Go orchestrator running a seven-trigger AI rules engine, a warm-pool manager and a five-state activation spine in Redis, on live Kubernetes (GKE) — sub-millisecond p50 restore, an 84.6% warm-pool hit rate, zero errors at 100 concurrent WebSocket clients; migrated DigitalOcean to Google Cloud in a 30-minute cutover; promoted from Core Engineer across three contracts, 471 of 488 commits solo.</w:t>
+        <w:t xml:space="preserve">Owned the Intelligence Layer of an app-activation platform: a Go orchestrator running a seven-trigger AI rules engine, a warm-pool manager and a five-state activation spine in Redis, on live Kubernetes (GKE) — sub-millisecond p50 restore, an 84.6% warm-pool hit rate, zero errors at 100 concurrent WebSocket clients; migrated DigitalOcean to Google Cloud in a 30-minute cutover; promoted from Core Engineer across three contracts, 471 of 488 commits solo, and live at ire.gavigo.com.</w:t>
       </w:r>
     </w:p>
     <w:p>
@@ -530,7 +530,7 @@
         <w:spacing w:after="60"/>
       </w:pPr>
       <w:r>
-        <w:t xml:space="preserve">Promoted to CTO leading a team of five; took the product from a no-code prototype to a multi-tenant B2B FemTech SaaS and built the IBM watsonx integration behind Sanicle's IBM Silver Partner certification.</w:t>
+        <w:t xml:space="preserve">Promoted to CTO leading a team of five; took the product from a no-code prototype to a multi-tenant B2B FemTech SaaS and built the company website and the IBM watsonx integration behind Sanicle's IBM Silver Partner certification.</w:t>
       </w:r>
     </w:p>
     <w:p>
@@ -643,7 +643,7 @@
             <w:color w:val="000000"/>
             <w:u w:val="single" w:color="000000"/>
           </w:rPr>
-          <w:t xml:space="preserve">Tam-AI-Ti</w:t>
+          <w:t xml:space="preserve">Google News MCP Server</w:t>
         </w:r>
       </w:hyperlink>
       <w:r>
@@ -655,7 +655,7 @@
             <w:color w:val="000000"/>
             <w:u w:val="single" w:color="000000"/>
           </w:rPr>
-          <w:t xml:space="preserve">tamaiti.whiri-ai.com</w:t>
+          <w:t xml:space="preserve">github.com/ChanMeng666/server-google-news</w:t>
         </w:r>
       </w:hyperlink>
     </w:p>
@@ -665,7 +665,7 @@
         <w:spacing w:after="140"/>
       </w:pPr>
       <w:r>
-        <w:t xml:space="preserve">A te reo Māori and English AI financial-wellness app built solo on commission from Riria (Missy) Te Kanawa herself, not her employer ASB Bank: three composed OpenAI models, one a realtime voice coach, culture as typed schema (Maramataka, Te Whare Tapa Whā); a 19-user cohort produced 181 journal entries in 4 months.</w:t>
+        <w:t xml:space="preserve">One of the earliest Model Context Protocol servers, shipped 35 days after Anthropic launched MCP and before a registry existed: a PulseMCP Top Pick, a Glama A-rating, and 129 GitHub stars.</w:t>
       </w:r>
     </w:p>
     <w:p>
@@ -681,7 +681,7 @@
             <w:color w:val="000000"/>
             <w:u w:val="single" w:color="000000"/>
           </w:rPr>
-          <w:t xml:space="preserve">Vitex - AI Career Agent</w:t>
+          <w:t xml:space="preserve">echook</w:t>
         </w:r>
       </w:hyperlink>
       <w:r>
@@ -693,7 +693,7 @@
             <w:color w:val="000000"/>
             <w:u w:val="single" w:color="000000"/>
           </w:rPr>
-          <w:t xml:space="preserve">vitex.org.nz</w:t>
+          <w:t xml:space="preserve">github.com/ChanMeng666/echook</w:t>
         </w:r>
       </w:hyperlink>
     </w:p>
@@ -703,7 +703,7 @@
         <w:spacing w:after="140"/>
       </w:pPr>
       <w:r>
-        <w:t xml:space="preserve">Paste a job description, get a tailored resume and cover letter scored against its keywords in under 30 seconds, with Typst compiling the finished PDF locally in under 100 ms across 7 templates.</w:t>
+        <w:t xml:space="preserve">An AI-operated hooks plugin for Claude Code, Cursor IDE and Codex CLI, installed and driven entirely in natural language, grown from audio notifications into session telemetry and four shipped Claude Code extension surfaces: hooks, skills, a context-window status line and plugin packaging.</w:t>
       </w:r>
     </w:p>
     <w:p>
@@ -719,7 +719,7 @@
             <w:color w:val="000000"/>
             <w:u w:val="single" w:color="000000"/>
           </w:rPr>
-          <w:t xml:space="preserve">Google News MCP Server</w:t>
+          <w:t xml:space="preserve">AI Programming Education Platform</w:t>
         </w:r>
       </w:hyperlink>
       <w:r>
@@ -731,7 +731,7 @@
             <w:color w:val="000000"/>
             <w:u w:val="single" w:color="000000"/>
           </w:rPr>
-          <w:t xml:space="preserve">github.com/ChanMeng666/server-google-news</w:t>
+          <w:t xml:space="preserve">programming.chanmeng.org</w:t>
         </w:r>
       </w:hyperlink>
     </w:p>
@@ -741,7 +741,7 @@
         <w:spacing w:after="140"/>
       </w:pPr>
       <w:r>
-        <w:t xml:space="preserve">One of the earliest Model Context Protocol servers, shipped 35 days after Anthropic launched MCP and before a registry existed: a PulseMCP Top Pick, a Glama A-rating, and 126 GitHub stars.</w:t>
+        <w:t xml:space="preserve">A bilingual Docusaurus platform (211 of 220 commits) carrying five cohort versions of AI-programming teaching side by side, three concurrent in 2026, for TechNest's 2026 AI Track and academyEX's Her Waka, with a Cloudflare Workers RAG assistant doing version-aware retrieval over 4,800 chunks.</w:t>
       </w:r>
     </w:p>
     <w:p>
@@ -757,7 +757,7 @@
             <w:color w:val="000000"/>
             <w:u w:val="single" w:color="000000"/>
           </w:rPr>
-          <w:t xml:space="preserve">echook</w:t>
+          <w:t xml:space="preserve">a11y-loop</w:t>
         </w:r>
       </w:hyperlink>
       <w:r>
@@ -769,7 +769,7 @@
             <w:color w:val="000000"/>
             <w:u w:val="single" w:color="000000"/>
           </w:rPr>
-          <w:t xml:space="preserve">github.com/ChanMeng666/echook</w:t>
+          <w:t xml:space="preserve">github.com/ChanMeng666/a11y-loop</w:t>
         </w:r>
       </w:hyperlink>
     </w:p>
@@ -779,27 +779,32 @@
         <w:spacing w:after="140"/>
       </w:pPr>
       <w:r>
-        <w:t xml:space="preserve">An AI-operated hooks plugin for Claude Code, Cursor IDE and Codex CLI, installed and driven entirely in natural language, grown from audio notifications into session telemetry and four shipped Claude Code extension surfaces: hooks, skills, a context-window status line and plugin packaging.</w:t>
-      </w:r>
-    </w:p>
-    <w:p>
-      <w:pPr>
-        <w:keepNext/>
-        <w:spacing w:after="40"/>
-      </w:pPr>
+        <w:t xml:space="preserve">A Claude Code skill and CLI that makes AI coding agents write accessible UI, audits it in a real browser (Playwright, axe-core, WCAG 2.2 AA) and lists what it could not check; being adopted by My Life My Voice, the disability-led New Zealand organisation that set the problem.</w:t>
+      </w:r>
+    </w:p>
+    <w:p>
+      <w:pPr>
+        <w:keepNext w:val="false"/>
+        <w:spacing w:after="120"/>
+      </w:pPr>
+      <w:r>
+        <w:rPr>
+          <w:b/>
+          <w:bCs/>
+        </w:rPr>
+        <w:t xml:space="preserve">Also built: </w:t>
+      </w:r>
       <w:hyperlink w:history="1" r:id="rIduffj7xbr20hrdzhzzipyv">
         <w:r>
           <w:rPr>
-            <w:b/>
-            <w:bCs/>
-            <w:color w:val="000000"/>
-            <w:u w:val="single" w:color="000000"/>
-          </w:rPr>
-          <w:t xml:space="preserve">AI Programming Education Platform</w:t>
-        </w:r>
-      </w:hyperlink>
-      <w:r>
-        <w:t xml:space="preserve"> | </w:t>
+            <w:color w:val="000000"/>
+            <w:u w:val="single" w:color="000000"/>
+          </w:rPr>
+          <w:t xml:space="preserve">eatropolis.co.nz</w:t>
+        </w:r>
+      </w:hyperlink>
+      <w:r>
+        <w:t xml:space="preserve"> (Auckland's official culinary festival, commissioned by Chow Luck Club Ltd with Auckland Council's agency Tātaki Auckland Unlimited), </w:t>
       </w:r>
       <w:hyperlink w:history="1" r:id="rIdjvs73hd-zl_8eaqhzwahb">
         <w:r>
@@ -807,30 +812,11 @@
             <w:color w:val="000000"/>
             <w:u w:val="single" w:color="000000"/>
           </w:rPr>
-          <w:t xml:space="preserve">programming.chanmeng.org</w:t>
-        </w:r>
-      </w:hyperlink>
-    </w:p>
-    <w:p>
-      <w:pPr>
-        <w:keepNext w:val="false"/>
-        <w:spacing w:after="140"/>
-      </w:pPr>
-      <w:r>
-        <w:t xml:space="preserve">A bilingual Docusaurus platform (211 of 220 commits) carrying five cohort versions of AI-programming teaching side by side, three concurrent in 2026, for TechNest's 2026 AI Track and academyEX's Her Waka, with a Cloudflare Workers RAG assistant doing version-aware retrieval over 4,800 chunks.</w:t>
-      </w:r>
-    </w:p>
-    <w:p>
-      <w:pPr>
-        <w:keepNext w:val="false"/>
-        <w:spacing w:after="120"/>
-      </w:pPr>
-      <w:r>
-        <w:rPr>
-          <w:b/>
-          <w:bCs/>
-        </w:rPr>
-        <w:t xml:space="preserve">Also built: </w:t>
+          <w:t xml:space="preserve">Vitex - AI Career Agent</w:t>
+        </w:r>
+      </w:hyperlink>
+      <w:r>
+        <w:t xml:space="preserve"> (a tailored resume and cover letter in under 30 seconds), </w:t>
       </w:r>
       <w:hyperlink w:history="1" r:id="rIdtbhrgiueb_b0gks_earoh">
         <w:r>
@@ -838,11 +824,11 @@
             <w:color w:val="000000"/>
             <w:u w:val="single" w:color="000000"/>
           </w:rPr>
-          <w:t xml:space="preserve">eatropolis.co.nz</w:t>
-        </w:r>
-      </w:hyperlink>
-      <w:r>
-        <w:t xml:space="preserve"> (Auckland's official culinary festival, commissioned by Chow Luck Club Ltd with Auckland Council's agency Tātaki Auckland Unlimited), </w:t>
+          <w:t xml:space="preserve">Seismophone</w:t>
+        </w:r>
+      </w:hyperlink>
+      <w:r>
+        <w:t xml:space="preserve"> (the first public Suno remix-lineage explorer), </w:t>
       </w:r>
       <w:hyperlink w:history="1" r:id="rIdep8wknycacp400yfxfitx">
         <w:r>
@@ -850,23 +836,45 @@
             <w:color w:val="000000"/>
             <w:u w:val="single" w:color="000000"/>
           </w:rPr>
+          <w:t xml:space="preserve">Tam-AI-Ti</w:t>
+        </w:r>
+      </w:hyperlink>
+      <w:r>
+        <w:t xml:space="preserve"> (a te reo Māori and English AI financial-wellness app; a 19-user cohort produced 181 journal entries in 4 months), and </w:t>
+      </w:r>
+      <w:hyperlink w:history="1" r:id="rIdqxs-t4hn6j0yydt9d0jhf">
+        <w:r>
+          <w:rPr>
+            <w:color w:val="000000"/>
+            <w:u w:val="single" w:color="000000"/>
+          </w:rPr>
           <w:t xml:space="preserve">gradient-svg-generator</w:t>
         </w:r>
       </w:hyperlink>
       <w:r>
-        <w:t xml:space="preserve"> (355 SVG templates), </w:t>
-      </w:r>
-      <w:hyperlink w:history="1" r:id="rIdqxs-t4hn6j0yydt9d0jhf">
-        <w:r>
-          <w:rPr>
-            <w:color w:val="000000"/>
-            <w:u w:val="single" w:color="000000"/>
-          </w:rPr>
-          <w:t xml:space="preserve">a11y-loop</w:t>
-        </w:r>
-      </w:hyperlink>
-      <w:r>
-        <w:t xml:space="preserve"> (an accessibility CLI and Claude Code skill, being adopted by My Life My Voice, the disability-led New Zealand organisation that set the problem), and </w:t>
+        <w:t xml:space="preserve"> (355 SVG templates).</w:t>
+      </w:r>
+    </w:p>
+    <w:p>
+      <w:pPr>
+        <w:pStyle w:val="Heading1"/>
+        <w:keepNext/>
+      </w:pPr>
+      <w:r>
+        <w:t xml:space="preserve">EDUCATION</w:t>
+      </w:r>
+    </w:p>
+    <w:p>
+      <w:pPr>
+        <w:keepNext w:val="false"/>
+        <w:spacing w:after="80"/>
+      </w:pPr>
+      <w:r>
+        <w:rPr>
+          <w:b/>
+          <w:bCs/>
+        </w:rPr>
+        <w:t xml:space="preserve">Master of Applied Computing, </w:t>
       </w:r>
       <w:hyperlink w:history="1" r:id="rIdsvvpz1dsdpz-geyvtr_q-">
         <w:r>
@@ -874,20 +882,11 @@
             <w:color w:val="000000"/>
             <w:u w:val="single" w:color="000000"/>
           </w:rPr>
-          <w:t xml:space="preserve">Seismophone</w:t>
-        </w:r>
-      </w:hyperlink>
-      <w:r>
-        <w:t xml:space="preserve"> (the first public Suno remix-lineage explorer).</w:t>
-      </w:r>
-    </w:p>
-    <w:p>
-      <w:pPr>
-        <w:pStyle w:val="Heading1"/>
-        <w:keepNext/>
-      </w:pPr>
-      <w:r>
-        <w:t xml:space="preserve">EDUCATION</w:t>
+          <w:t xml:space="preserve">Lincoln University, New Zealand</w:t>
+        </w:r>
+      </w:hyperlink>
+      <w:r>
+        <w:t xml:space="preserve"> | Nov 2023 - Dec 2024 | Distinction, Dean's List (Top 5%)</w:t>
       </w:r>
     </w:p>
     <w:p>
@@ -900,34 +899,9 @@
           <w:b/>
           <w:bCs/>
         </w:rPr>
-        <w:t xml:space="preserve">Master of Applied Computing, </w:t>
+        <w:t xml:space="preserve">Bachelor of Geography Science, </w:t>
       </w:r>
       <w:hyperlink w:history="1" r:id="rIdm2dpgx4-jnu98sceclamr">
-        <w:r>
-          <w:rPr>
-            <w:color w:val="000000"/>
-            <w:u w:val="single" w:color="000000"/>
-          </w:rPr>
-          <w:t xml:space="preserve">Lincoln University, New Zealand</w:t>
-        </w:r>
-      </w:hyperlink>
-      <w:r>
-        <w:t xml:space="preserve"> | Nov 2023 - Dec 2024 | Distinction, Dean's List (Top 5%)</w:t>
-      </w:r>
-    </w:p>
-    <w:p>
-      <w:pPr>
-        <w:keepNext w:val="false"/>
-        <w:spacing w:after="80"/>
-      </w:pPr>
-      <w:r>
-        <w:rPr>
-          <w:b/>
-          <w:bCs/>
-        </w:rPr>
-        <w:t xml:space="preserve">Bachelor of Geography Science, </w:t>
-      </w:r>
-      <w:hyperlink w:history="1" r:id="rIdtbouiudxiypbx3b0muecz">
         <w:r>
           <w:rPr>
             <w:color w:val="000000"/>
@@ -1026,7 +1000,7 @@
         <w:spacing w:after="60"/>
       </w:pPr>
       <w:r>
-        <w:t xml:space="preserve">Community: 480+ GitHub stars on own repos, 26 LinkedIn recommendations, 2 merged CopilotKit PRs.</w:t>
+        <w:t xml:space="preserve">Community: 530+ GitHub stars on own repos, 27 LinkedIn recommendations, 2 merged CopilotKit PRs.</w:t>
       </w:r>
     </w:p>
     <w:sectPr>

</xml_diff>

<commit_message>
chore(cv,linkedin): drop archived Vitex and FreePeriod project mentions
Co-Authored-By: Claude Opus 5.5 <noreply@anthropic.com>
</commit_message>
<xml_diff>
--- a/cv/exports/chan-meng-cv-ats.docx
+++ b/cv/exports/chan-meng-cv-ats.docx
@@ -812,11 +812,11 @@
             <w:color w:val="000000"/>
             <w:u w:val="single" w:color="000000"/>
           </w:rPr>
-          <w:t xml:space="preserve">Vitex - AI Career Agent</w:t>
-        </w:r>
-      </w:hyperlink>
-      <w:r>
-        <w:t xml:space="preserve"> (a tailored resume and cover letter in under 30 seconds), </w:t>
+          <w:t xml:space="preserve">Seismophone</w:t>
+        </w:r>
+      </w:hyperlink>
+      <w:r>
+        <w:t xml:space="preserve"> (the first public Suno remix-lineage explorer), </w:t>
       </w:r>
       <w:hyperlink w:history="1" r:id="rIdtbhrgiueb_b0gks_earoh">
         <w:r>
@@ -824,11 +824,11 @@
             <w:color w:val="000000"/>
             <w:u w:val="single" w:color="000000"/>
           </w:rPr>
-          <w:t xml:space="preserve">Seismophone</w:t>
-        </w:r>
-      </w:hyperlink>
-      <w:r>
-        <w:t xml:space="preserve"> (the first public Suno remix-lineage explorer), </w:t>
+          <w:t xml:space="preserve">Tam-AI-Ti</w:t>
+        </w:r>
+      </w:hyperlink>
+      <w:r>
+        <w:t xml:space="preserve"> (a te reo Māori and English AI financial-wellness app; a 19-user cohort produced 181 journal entries in 4 months), and </w:t>
       </w:r>
       <w:hyperlink w:history="1" r:id="rIdep8wknycacp400yfxfitx">
         <w:r>
@@ -836,11 +836,33 @@
             <w:color w:val="000000"/>
             <w:u w:val="single" w:color="000000"/>
           </w:rPr>
-          <w:t xml:space="preserve">Tam-AI-Ti</w:t>
-        </w:r>
-      </w:hyperlink>
-      <w:r>
-        <w:t xml:space="preserve"> (a te reo Māori and English AI financial-wellness app; a 19-user cohort produced 181 journal entries in 4 months), and </w:t>
+          <w:t xml:space="preserve">gradient-svg-generator</w:t>
+        </w:r>
+      </w:hyperlink>
+      <w:r>
+        <w:t xml:space="preserve"> (355 SVG templates).</w:t>
+      </w:r>
+    </w:p>
+    <w:p>
+      <w:pPr>
+        <w:pStyle w:val="Heading1"/>
+        <w:keepNext/>
+      </w:pPr>
+      <w:r>
+        <w:t xml:space="preserve">EDUCATION</w:t>
+      </w:r>
+    </w:p>
+    <w:p>
+      <w:pPr>
+        <w:keepNext w:val="false"/>
+        <w:spacing w:after="80"/>
+      </w:pPr>
+      <w:r>
+        <w:rPr>
+          <w:b/>
+          <w:bCs/>
+        </w:rPr>
+        <w:t xml:space="preserve">Master of Applied Computing, </w:t>
       </w:r>
       <w:hyperlink w:history="1" r:id="rIdqxs-t4hn6j0yydt9d0jhf">
         <w:r>
@@ -848,20 +870,11 @@
             <w:color w:val="000000"/>
             <w:u w:val="single" w:color="000000"/>
           </w:rPr>
-          <w:t xml:space="preserve">gradient-svg-generator</w:t>
-        </w:r>
-      </w:hyperlink>
-      <w:r>
-        <w:t xml:space="preserve"> (355 SVG templates).</w:t>
-      </w:r>
-    </w:p>
-    <w:p>
-      <w:pPr>
-        <w:pStyle w:val="Heading1"/>
-        <w:keepNext/>
-      </w:pPr>
-      <w:r>
-        <w:t xml:space="preserve">EDUCATION</w:t>
+          <w:t xml:space="preserve">Lincoln University, New Zealand</w:t>
+        </w:r>
+      </w:hyperlink>
+      <w:r>
+        <w:t xml:space="preserve"> | Nov 2023 - Dec 2024 | Distinction, Dean's List (Top 5%)</w:t>
       </w:r>
     </w:p>
     <w:p>
@@ -874,34 +887,9 @@
           <w:b/>
           <w:bCs/>
         </w:rPr>
-        <w:t xml:space="preserve">Master of Applied Computing, </w:t>
+        <w:t xml:space="preserve">Bachelor of Geography Science, </w:t>
       </w:r>
       <w:hyperlink w:history="1" r:id="rIdsvvpz1dsdpz-geyvtr_q-">
-        <w:r>
-          <w:rPr>
-            <w:color w:val="000000"/>
-            <w:u w:val="single" w:color="000000"/>
-          </w:rPr>
-          <w:t xml:space="preserve">Lincoln University, New Zealand</w:t>
-        </w:r>
-      </w:hyperlink>
-      <w:r>
-        <w:t xml:space="preserve"> | Nov 2023 - Dec 2024 | Distinction, Dean's List (Top 5%)</w:t>
-      </w:r>
-    </w:p>
-    <w:p>
-      <w:pPr>
-        <w:keepNext w:val="false"/>
-        <w:spacing w:after="80"/>
-      </w:pPr>
-      <w:r>
-        <w:rPr>
-          <w:b/>
-          <w:bCs/>
-        </w:rPr>
-        <w:t xml:space="preserve">Bachelor of Geography Science, </w:t>
-      </w:r>
-      <w:hyperlink w:history="1" r:id="rIdm2dpgx4-jnu98sceclamr">
         <w:r>
           <w:rPr>
             <w:color w:val="000000"/>

</xml_diff>

<commit_message>
feat(readme): own banners and pills; take Chromaflow off the shopfront
The README no longer embeds gradient-svg-generator. The hero, the two
section strips, the footer band and the eight link pills are committed
SVGs in public/readme, drawn in the Caldera system by `npm run build:art`
(scripts/build-readme-art.mjs, listed in brand.yaml signatures.readmeArt).
The credit captions are gone and no copy says the tool powers this profile.

Chromaflow also leaves the other visitor-facing surfaces: the README
craft table, the "Also built" line of the designed CV and the ATS resume
(now two links), and its extended-CV tile (now the Google Jobs MCP
Server). It keeps its narrative in llms.txt / llms-full.txt and its row
in the lineage map (showcase: listed). All three CVs rebuilt.

Four partials no template included were removed; each embedded the tool.

Co-Authored-By: Claude Opus 5.5 <noreply@anthropic.com>
</commit_message>
<xml_diff>
--- a/cv/exports/chan-meng-cv-ats.docx
+++ b/cv/exports/chan-meng-cv-ats.docx
@@ -804,7 +804,7 @@
         </w:r>
       </w:hyperlink>
       <w:r>
-        <w:t xml:space="preserve"> (Auckland's official culinary festival, commissioned by Chow Luck Club Ltd with Auckland Council's agency Tātaki Auckland Unlimited), </w:t>
+        <w:t xml:space="preserve"> (Auckland's official culinary festival, commissioned by Chow Luck Club Ltd with Auckland Council's agency Tātaki Auckland Unlimited) and </w:t>
       </w:r>
       <w:hyperlink w:history="1" r:id="rIdjvs73hd-zl_8eaqhzwahb">
         <w:r>
@@ -816,7 +816,29 @@
         </w:r>
       </w:hyperlink>
       <w:r>
-        <w:t xml:space="preserve"> (a te reo Māori and English AI financial-wellness app; a 19-user cohort produced 181 journal entries in 4 months), and </w:t>
+        <w:t xml:space="preserve"> (a te reo Māori and English AI financial-wellness app; a 19-user cohort produced 181 journal entries in 4 months).</w:t>
+      </w:r>
+    </w:p>
+    <w:p>
+      <w:pPr>
+        <w:pStyle w:val="Heading1"/>
+        <w:keepNext/>
+      </w:pPr>
+      <w:r>
+        <w:t xml:space="preserve">EDUCATION</w:t>
+      </w:r>
+    </w:p>
+    <w:p>
+      <w:pPr>
+        <w:keepNext w:val="false"/>
+        <w:spacing w:after="80"/>
+      </w:pPr>
+      <w:r>
+        <w:rPr>
+          <w:b/>
+          <w:bCs/>
+        </w:rPr>
+        <w:t xml:space="preserve">Master of Applied Computing, </w:t>
       </w:r>
       <w:hyperlink w:history="1" r:id="rIdtbhrgiueb_b0gks_earoh">
         <w:r>
@@ -824,20 +846,11 @@
             <w:color w:val="000000"/>
             <w:u w:val="single" w:color="000000"/>
           </w:rPr>
-          <w:t xml:space="preserve">gradient-svg-generator</w:t>
-        </w:r>
-      </w:hyperlink>
-      <w:r>
-        <w:t xml:space="preserve"> (355 SVG templates).</w:t>
-      </w:r>
-    </w:p>
-    <w:p>
-      <w:pPr>
-        <w:pStyle w:val="Heading1"/>
-        <w:keepNext/>
-      </w:pPr>
-      <w:r>
-        <w:t xml:space="preserve">EDUCATION</w:t>
+          <w:t xml:space="preserve">Lincoln University, New Zealand</w:t>
+        </w:r>
+      </w:hyperlink>
+      <w:r>
+        <w:t xml:space="preserve"> | Nov 2023 - Dec 2024 | Distinction, Dean's List (Top 5%)</w:t>
       </w:r>
     </w:p>
     <w:p>
@@ -850,34 +863,9 @@
           <w:b/>
           <w:bCs/>
         </w:rPr>
-        <w:t xml:space="preserve">Master of Applied Computing, </w:t>
+        <w:t xml:space="preserve">Bachelor of Geography Science, </w:t>
       </w:r>
       <w:hyperlink w:history="1" r:id="rIdep8wknycacp400yfxfitx">
-        <w:r>
-          <w:rPr>
-            <w:color w:val="000000"/>
-            <w:u w:val="single" w:color="000000"/>
-          </w:rPr>
-          <w:t xml:space="preserve">Lincoln University, New Zealand</w:t>
-        </w:r>
-      </w:hyperlink>
-      <w:r>
-        <w:t xml:space="preserve"> | Nov 2023 - Dec 2024 | Distinction, Dean's List (Top 5%)</w:t>
-      </w:r>
-    </w:p>
-    <w:p>
-      <w:pPr>
-        <w:keepNext w:val="false"/>
-        <w:spacing w:after="80"/>
-      </w:pPr>
-      <w:r>
-        <w:rPr>
-          <w:b/>
-          <w:bCs/>
-        </w:rPr>
-        <w:t xml:space="preserve">Bachelor of Geography Science, </w:t>
-      </w:r>
-      <w:hyperlink w:history="1" r:id="rIdqxs-t4hn6j0yydt9d0jhf">
         <w:r>
           <w:rPr>
             <w:color w:val="000000"/>

</xml_diff>